<commit_message>
Update email in Portfolio-Content.docx to cmabijesh.ae@gmail.com
Co-Authored-By: Claude Sonnet 5.5 <noreply@anthropic.com>
Claude-Session: https://claude.ai/code/session_01Y26Hayw4vwhXQHhAKoe7uh
</commit_message>
<xml_diff>
--- a/Portfolio-Content.docx
+++ b/Portfolio-Content.docx
@@ -105,7 +105,7 @@
         <w:spacing w:after="120"/>
       </w:pPr>
       <w:r>
-        <w:t xml:space="preserve">Email: cmabijeshbj@gmail.com</w:t>
+        <w:t xml:space="preserve">Email: cmabijesh.ae@gmail.com</w:t>
       </w:r>
     </w:p>
     <w:p>
@@ -936,7 +936,7 @@
         <w:spacing w:after="120"/>
       </w:pPr>
       <w:r>
-        <w:t xml:space="preserve">Email: cmabijeshbj@gmail.com</w:t>
+        <w:t xml:space="preserve">Email: cmabijesh.ae@gmail.com</w:t>
       </w:r>
     </w:p>
     <w:p>

</xml_diff>